<commit_message>
string changed to Hello, World! and table name changed to users
</commit_message>
<xml_diff>
--- a/day_1/Screenshots for Proof.docx
+++ b/day_1/Screenshots for Proof.docx
@@ -5,10 +5,10 @@
     <w:p>
       <w:r>
         <w:drawing>
-          <wp:inline distT="0" distB="0" distL="0" distR="0" wp14:anchorId="330DA0C7" wp14:editId="2CDDAE63">
-            <wp:extent cx="5121084" cy="3147333"/>
-            <wp:effectExtent l="0" t="0" r="3810" b="0"/>
-            <wp:docPr id="175159902" name="Picture 1"/>
+          <wp:inline distT="0" distB="0" distL="0" distR="0" wp14:anchorId="587C2A18" wp14:editId="2E67ADE4">
+            <wp:extent cx="4435224" cy="2034716"/>
+            <wp:effectExtent l="0" t="0" r="3810" b="3810"/>
+            <wp:docPr id="1306816545" name="Picture 1"/>
             <wp:cNvGraphicFramePr>
               <a:graphicFrameLocks xmlns:a="http://schemas.openxmlformats.org/drawingml/2006/main" noChangeAspect="1"/>
             </wp:cNvGraphicFramePr>
@@ -16,7 +16,7 @@
               <a:graphicData uri="http://schemas.openxmlformats.org/drawingml/2006/picture">
                 <pic:pic xmlns:pic="http://schemas.openxmlformats.org/drawingml/2006/picture">
                   <pic:nvPicPr>
-                    <pic:cNvPr id="175159902" name=""/>
+                    <pic:cNvPr id="1306816545" name=""/>
                     <pic:cNvPicPr/>
                   </pic:nvPicPr>
                   <pic:blipFill>
@@ -28,7 +28,7 @@
                   <pic:spPr>
                     <a:xfrm>
                       <a:off x="0" y="0"/>
-                      <a:ext cx="5121084" cy="3147333"/>
+                      <a:ext cx="4435224" cy="2034716"/>
                     </a:xfrm>
                     <a:prstGeom prst="rect">
                       <a:avLst/>
@@ -43,15 +43,7 @@
     </w:p>
     <w:p>
       <w:r>
-        <w:t xml:space="preserve">Fig </w:t>
-      </w:r>
-      <w:proofErr w:type="gramStart"/>
-      <w:r>
-        <w:t>1.1 :</w:t>
-      </w:r>
-      <w:proofErr w:type="gramEnd"/>
-      <w:r>
-        <w:t xml:space="preserve"> /hello endpoint created which returns string “Hello World”</w:t>
+        <w:t>Fig 1.1 : /hello endpoint created which returns string “Hello World”</w:t>
       </w:r>
     </w:p>
     <w:p/>
@@ -103,10 +95,10 @@
     <w:p>
       <w:r>
         <w:drawing>
-          <wp:inline distT="0" distB="0" distL="0" distR="0" wp14:anchorId="680DFF1C" wp14:editId="7C00BC6B">
-            <wp:extent cx="2301439" cy="1371719"/>
+          <wp:inline distT="0" distB="0" distL="0" distR="0" wp14:anchorId="136367EC" wp14:editId="679687BF">
+            <wp:extent cx="1806097" cy="1371719"/>
             <wp:effectExtent l="0" t="0" r="3810" b="0"/>
-            <wp:docPr id="376738587" name="Picture 1"/>
+            <wp:docPr id="1030179416" name="Picture 1"/>
             <wp:cNvGraphicFramePr>
               <a:graphicFrameLocks xmlns:a="http://schemas.openxmlformats.org/drawingml/2006/main" noChangeAspect="1"/>
             </wp:cNvGraphicFramePr>
@@ -114,7 +106,7 @@
               <a:graphicData uri="http://schemas.openxmlformats.org/drawingml/2006/picture">
                 <pic:pic xmlns:pic="http://schemas.openxmlformats.org/drawingml/2006/picture">
                   <pic:nvPicPr>
-                    <pic:cNvPr id="376738587" name=""/>
+                    <pic:cNvPr id="1030179416" name=""/>
                     <pic:cNvPicPr/>
                   </pic:nvPicPr>
                   <pic:blipFill>
@@ -126,7 +118,7 @@
                   <pic:spPr>
                     <a:xfrm>
                       <a:off x="0" y="0"/>
-                      <a:ext cx="2301439" cy="1371719"/>
+                      <a:ext cx="1806097" cy="1371719"/>
                     </a:xfrm>
                     <a:prstGeom prst="rect">
                       <a:avLst/>
@@ -141,13 +133,8 @@
     </w:p>
     <w:p>
       <w:r>
-        <w:t xml:space="preserve">Fig 1.3: Table created successfully in the database </w:t>
+        <w:t>Fig 1.3: Table created successfully in the database intern_demo</w:t>
       </w:r>
-      <w:proofErr w:type="spellStart"/>
-      <w:r>
-        <w:t>intern_demo</w:t>
-      </w:r>
-      <w:proofErr w:type="spellEnd"/>
     </w:p>
     <w:sectPr>
       <w:pgSz w:w="12240" w:h="15840"/>

</xml_diff>

<commit_message>
Proof of postgresql added properly in the doc
</commit_message>
<xml_diff>
--- a/day_1/Screenshots for Proof.docx
+++ b/day_1/Screenshots for Proof.docx
@@ -50,10 +50,10 @@
     <w:p>
       <w:r>
         <w:drawing>
-          <wp:inline distT="0" distB="0" distL="0" distR="0" wp14:anchorId="53EB18B4" wp14:editId="7B94F0D0">
-            <wp:extent cx="6511290" cy="1453215"/>
-            <wp:effectExtent l="0" t="0" r="3810" b="0"/>
-            <wp:docPr id="815840163" name="Picture 1"/>
+          <wp:inline distT="0" distB="0" distL="0" distR="0" wp14:anchorId="3F4C1936" wp14:editId="18D5F8BB">
+            <wp:extent cx="5943600" cy="1530985"/>
+            <wp:effectExtent l="0" t="0" r="0" b="0"/>
+            <wp:docPr id="816883279" name="Picture 1"/>
             <wp:cNvGraphicFramePr>
               <a:graphicFrameLocks xmlns:a="http://schemas.openxmlformats.org/drawingml/2006/main" noChangeAspect="1"/>
             </wp:cNvGraphicFramePr>
@@ -61,7 +61,7 @@
               <a:graphicData uri="http://schemas.openxmlformats.org/drawingml/2006/picture">
                 <pic:pic xmlns:pic="http://schemas.openxmlformats.org/drawingml/2006/picture">
                   <pic:nvPicPr>
-                    <pic:cNvPr id="815840163" name=""/>
+                    <pic:cNvPr id="816883279" name=""/>
                     <pic:cNvPicPr/>
                   </pic:nvPicPr>
                   <pic:blipFill>
@@ -73,7 +73,7 @@
                   <pic:spPr>
                     <a:xfrm>
                       <a:off x="0" y="0"/>
-                      <a:ext cx="6556573" cy="1463321"/>
+                      <a:ext cx="5943600" cy="1530985"/>
                     </a:xfrm>
                     <a:prstGeom prst="rect">
                       <a:avLst/>

</xml_diff>